<commit_message>
Correct KTH documents: no Fusion 360/FEM in PhD, machining and assembly in bachelor's
Co-Authored-By: Claude Opus 5.5 <noreply@anthropic.com>
Claude-Session: https://claude.ai/code/session_01NjdMuB9buEkMmyf7HkyEWg
</commit_message>
<xml_diff>
--- a/applications/KTH_Research_Engineer_Wearable_Robotics/Arunabha_Majumder_CV_KTH.docx
+++ b/applications/KTH_Research_Engineer_Wearable_Robotics/Arunabha_Majumder_CV_KTH.docx
@@ -76,7 +76,7 @@
           <w:b w:val="0"/>
           <w:i w:val="0"/>
         </w:rPr>
-        <w:t>Researcher in wearable robotics and exoskeletons with hands-on experience across the full mechatronic chain: actuator and transmission design (compliant and soft pneumatic actuators), CAD and FEM, 3D-printed prototypes, sensor integration, motion and force control in MATLAB/Python, and experimental validation with human participants. Best Paper Award, IFToMM ISRM 2026.</w:t>
+        <w:t>Researcher in wearable robotics and exoskeletons with hands-on experience across the full mechatronic chain: actuator and transmission design (compliant and soft pneumatic actuators), CAD (SolidWorks), 3D-printed prototypes, sensor integration, motion and force control in MATLAB/Python, and experimental validation with human participants. Best Paper Award, IFToMM ISRM 2026.</w:t>
       </w:r>
     </w:p>
     <w:p>
@@ -197,7 +197,7 @@
         <w:spacing w:after="40"/>
       </w:pPr>
       <w:r>
-        <w:t>Developed functional robot prototypes from concept to experimental validation through iterative design in SolidWorks and Fusion 360, FEM of load-carrying parts, 3D printing, machining and hands-on assembly.</w:t>
+        <w:t>Developed functional robot prototypes from concept to experimental validation through iterative design in SolidWorks and 3D-printed prototypes.</w:t>
       </w:r>
     </w:p>
     <w:p>
@@ -312,7 +312,7 @@
         <w:spacing w:after="40"/>
       </w:pPr>
       <w:r>
-        <w:t>Led CAD design, fabrication and user testing of a rehabilitation exoskeleton; Best Major Project Award and INR 100,000 TATA Technologies Innovation Grant.</w:t>
+        <w:t>Led CAD design, machining, hands-on assembly and user testing of a rehabilitation exoskeleton; Best Major Project Award and INR 100,000 TATA Technologies Innovation Grant.</w:t>
       </w:r>
     </w:p>
     <w:p>
@@ -471,7 +471,7 @@
         <w:t xml:space="preserve">Design &amp; prototyping: </w:t>
       </w:r>
       <w:r>
-        <w:t>SolidWorks (CSWA), Fusion 360, FEM/FEA, 3D printing, machining, assembly</w:t>
+        <w:t>SolidWorks (CSWA), 3D printing; machining and assembly (Bachelor's)</w:t>
       </w:r>
     </w:p>
     <w:p>

</xml_diff>

<commit_message>
KTH: correct Master's role, add drawing skills, plainer wording
Co-Authored-By: Claude Opus 5.5 <noreply@anthropic.com>
Claude-Session: https://claude.ai/code/session_01NjdMuB9buEkMmyf7HkyEWg
</commit_message>
<xml_diff>
--- a/applications/KTH_Research_Engineer_Wearable_Robotics/Arunabha_Majumder_CV_KTH.docx
+++ b/applications/KTH_Research_Engineer_Wearable_Robotics/Arunabha_Majumder_CV_KTH.docx
@@ -76,7 +76,7 @@
           <w:b w:val="0"/>
           <w:i w:val="0"/>
         </w:rPr>
-        <w:t>Researcher in wearable robotics and exoskeletons with hands-on experience across the full mechatronic chain: actuator and transmission design (compliant and soft pneumatic actuators), CAD (SolidWorks), 3D-printed prototypes, sensor integration, motion and force control in MATLAB/Python, and experimental validation with human participants. Best Paper Award, IFToMM ISRM 2026.</w:t>
+        <w:t>I design and build exoskeletons. In my PhD at Aalborg University I took a shoulder exoskeleton from hand sketches to a tested prototype: compliant actuator design, SolidWorks, 3D printing, motor and sensor integration, control in MATLAB and Python, and experiments with 12 participants. The design cut energy use by more than 25% and won the Best Paper Award at IFToMM ISRM 2026. I have also worked hands-on with soft pneumatic artificial muscles.</w:t>
       </w:r>
     </w:p>
     <w:p>
@@ -224,7 +224,7 @@
         <w:spacing w:after="40"/>
       </w:pPr>
       <w:r>
-        <w:t>Collected a full experimental dataset, using EMG and motion capture, by conducting experiments with 12 participants across 3 assistance modes and 2 load conditions.</w:t>
+        <w:t>Collected the full experimental dataset with EMG and motion capture in experiments with 12 participants across 3 assistance modes and 2 load conditions.</w:t>
       </w:r>
     </w:p>
     <w:p>
@@ -244,7 +244,7 @@
         <w:rPr>
           <w:b/>
         </w:rPr>
-        <w:t>MTech Researcher – Soft Pneumatic Actuators (Master's Thesis)</w:t>
+        <w:t>MTech Researcher – Pneumatic Artificial Muscles (Master's Thesis)</w:t>
       </w:r>
       <w:r>
         <w:t xml:space="preserve"> | 2020 – 2022</w:t>
@@ -268,7 +268,7 @@
         <w:spacing w:after="40"/>
       </w:pPr>
       <w:r>
-        <w:t>Reduced position-tracking error to 0.3–0.78%, outperforming classical PID, by developing a neural-network-based gain-scheduled controller in MATLAB/Simulink for a non-linear soft pneumatic artificial muscle.</w:t>
+        <w:t>Brought position error down to 0.3-0.78%, better than a standard PID, by working on the outer PID loop of a neural-network gain-scheduled controller in MATLAB/Simulink. I collected the experimental data, fed it to the lab's existing neural network and used its output to set the PID gains (IEEE CONECCT 2022).</w:t>
       </w:r>
     </w:p>
     <w:p>
@@ -277,7 +277,7 @@
         <w:spacing w:after="40"/>
       </w:pPr>
       <w:r>
-        <w:t>Characterised soft actuator behaviour experimentally by fabricating pneumatic artificial muscles from raw materials and building a test rig with valves, pressure sensors and DAQ; published at IEEE CONECCT 2022.</w:t>
+        <w:t>Fabricated and assembled soft pneumatic artificial muscles to an existing lab design and tested them on the lab's setup with valves, pressure sensors and DAQ.</w:t>
       </w:r>
     </w:p>
     <w:p>
@@ -517,6 +517,21 @@
       </w:r>
       <w:r>
         <w:t>Motors, encoders, force/torque sensors, pressure sensors, DAQ, EMG, Qualisys motion capture</w:t>
+      </w:r>
+    </w:p>
+    <w:p>
+      <w:pPr>
+        <w:pStyle w:val="ListBullet"/>
+        <w:spacing w:after="40"/>
+      </w:pPr>
+      <w:r>
+        <w:rPr>
+          <w:b/>
+        </w:rPr>
+        <w:t xml:space="preserve">Drawing: </w:t>
+      </w:r>
+      <w:r>
+        <w:t>Diploma in Fine Arts; hand sketches of concepts, technical illustrations and figures for papers, posters and demos</w:t>
       </w:r>
     </w:p>
     <w:p>

</xml_diff>

<commit_message>
Assist-as-Needed controller described as 3-person team work with his exact part
Co-Authored-By: Claude Opus 5.5 <noreply@anthropic.com>
Claude-Session: https://claude.ai/code/session_01NjdMuB9buEkMmyf7HkyEWg
</commit_message>
<xml_diff>
--- a/applications/KTH_Research_Engineer_Wearable_Robotics/Arunabha_Majumder_CV_KTH.docx
+++ b/applications/KTH_Research_Engineer_Wearable_Robotics/Arunabha_Majumder_CV_KTH.docx
@@ -122,7 +122,7 @@
         <w:t>&gt;15%</w:t>
       </w:r>
       <w:r>
-        <w:t xml:space="preserve"> lower user muscle effort with Assist-as-Needed control</w:t>
+        <w:t xml:space="preserve"> lower user muscle effort with an Assist-as-Needed controller built in a team of 3</w:t>
       </w:r>
     </w:p>
     <w:p>
@@ -206,7 +206,7 @@
         <w:spacing w:after="40"/>
       </w:pPr>
       <w:r>
-        <w:t>Reduced user muscle effort by more than 15%, measured with EMG, by integrating and controlling the motor, encoder and force sensors with an Assist-as-Needed controller for physical human-robot interaction.</w:t>
+        <w:t>Integrated the motor, encoder and force sensors on the exoskeleton, and worked in a team of 3 on its Assist-as-Needed controller: I helped with the equations, such as the Fourier fit, and defined how the GUI should behave. User muscle effort dropped by more than 15%, measured with EMG.</w:t>
       </w:r>
     </w:p>
     <w:p>
@@ -501,7 +501,7 @@
         <w:t xml:space="preserve">Control: </w:t>
       </w:r>
       <w:r>
-        <w:t>Assist-as-Needed control on hardware, PID tuning, gain scheduling, kinematics and Jacobian-based force estimation</w:t>
+        <w:t>Assist-as-Needed control (team work: equations incl. Fourier fit, GUI logic), PID tuning, kinematics and Jacobian-based force estimation</w:t>
       </w:r>
     </w:p>
     <w:p>

</xml_diff>